<commit_message>
docs: memoria/MEMORIA_TFM | defensa TFT, Anexo I, declaración IA | experiments: tests estadísticos
</commit_message>
<xml_diff>
--- a/INFORMACIÓN GENERAL/P11_06_F10 Solicitud defensa del TFT_v05.docx
+++ b/INFORMACIÓN GENERAL/P11_06_F10 Solicitud defensa del TFT_v05.docx
@@ -132,7 +132,7 @@
                   <w:rPr>
                     <w:rStyle w:val="Estilo3"/>
                   </w:rPr>
-                  <w:t>SERGIO MOYA MRIN</w:t>
+                  <w:t>Sergio Moya Marín</w:t>
                 </w:r>
               </w:sdtContent>
             </w:sdt>
@@ -336,10 +336,7 @@
         <w:t xml:space="preserve"> las asignaturas obligatorias y optativas del </w:t>
       </w:r>
       <w:r>
-        <w:t>Máster Universitario en Ingeniería Industrial</w:t>
-      </w:r>
-      <w:r>
-        <w:t xml:space="preserve"> </w:t>
+        <w:t xml:space="preserve">Máster Universitario en Ingeniería Industrial </w:t>
       </w:r>
       <w:r>
         <w:t>y teniendo todo superado</w:t>
@@ -442,24 +439,14 @@
                 <w:placeholder>
                   <w:docPart w:val="CCD2122708FE4206991693B0CA7A7480"/>
                 </w:placeholder>
-                <w:showingPlcHdr/>
                 <w:text/>
               </w:sdtPr>
-              <w:sdtEndPr>
-                <w:rPr>
-                  <w:rStyle w:val="Estilo1"/>
-                  <w:rFonts w:ascii="Arial" w:eastAsia="Times New Roman" w:hAnsi="Arial"/>
-                  <w:sz w:val="20"/>
-                  <w:lang w:eastAsia="es-ES"/>
-                </w:rPr>
-              </w:sdtEndPr>
               <w:sdtContent>
                 <w:r>
                   <w:rPr>
-                    <w:rStyle w:val="Textodelmarcadordeposicin"/>
-                    <w:sz w:val="20"/>
+                    <w:rStyle w:val="Estilo3"/>
                   </w:rPr>
-                  <w:t>Nombre del director</w:t>
+                  <w:t>Bady Patricio Gana Castillo</w:t>
                 </w:r>
               </w:sdtContent>
             </w:sdt>
@@ -526,6 +513,36 @@
       <w:sdt>
         <w:sdtPr>
           <w:id w:val="402717256"/>
+          <w14:checkbox>
+            <w14:checked w14:val="0"/>
+            <w14:checkedState w14:val="2612" w14:font="MS Gothic"/>
+            <w14:uncheckedState w14:val="2610" w14:font="MS Gothic"/>
+          </w14:checkbox>
+        </w:sdtPr>
+        <w:sdtContent>
+          <w:r>
+            <w:rPr>
+              <w:rFonts w:ascii="MS Gothic" w:eastAsia="MS Gothic" w:hAnsi="MS Gothic" w:hint="eastAsia"/>
+            </w:rPr>
+            <w:t>☐</w:t>
+          </w:r>
+        </w:sdtContent>
+      </w:sdt>
+      <w:r>
+        <w:t xml:space="preserve">   Autorizo</w:t>
+      </w:r>
+      <w:r>
+        <w:tab/>
+      </w:r>
+      <w:r>
+        <w:tab/>
+      </w:r>
+      <w:r>
+        <w:tab/>
+      </w:r>
+      <w:sdt>
+        <w:sdtPr>
+          <w:id w:val="784309991"/>
           <w14:checkbox>
             <w14:checked w14:val="1"/>
             <w14:checkedState w14:val="2612" w14:font="MS Gothic"/>
@@ -538,36 +555,6 @@
               <w:rFonts w:ascii="MS Gothic" w:eastAsia="MS Gothic" w:hAnsi="MS Gothic" w:hint="eastAsia"/>
             </w:rPr>
             <w:t>☒</w:t>
-          </w:r>
-        </w:sdtContent>
-      </w:sdt>
-      <w:r>
-        <w:t xml:space="preserve">   Autorizo</w:t>
-      </w:r>
-      <w:r>
-        <w:tab/>
-      </w:r>
-      <w:r>
-        <w:tab/>
-      </w:r>
-      <w:r>
-        <w:tab/>
-      </w:r>
-      <w:sdt>
-        <w:sdtPr>
-          <w:id w:val="784309991"/>
-          <w14:checkbox>
-            <w14:checked w14:val="0"/>
-            <w14:checkedState w14:val="2612" w14:font="MS Gothic"/>
-            <w14:uncheckedState w14:val="2610" w14:font="MS Gothic"/>
-          </w14:checkbox>
-        </w:sdtPr>
-        <w:sdtContent>
-          <w:r>
-            <w:rPr>
-              <w:rFonts w:ascii="MS Gothic" w:eastAsia="MS Gothic" w:hAnsi="MS Gothic"/>
-            </w:rPr>
-            <w:t>☐</w:t>
           </w:r>
         </w:sdtContent>
       </w:sdt>
@@ -2275,12 +2262,14 @@
     <w:rsid w:val="005D0130"/>
     <w:rsid w:val="005E51BE"/>
     <w:rsid w:val="00624E75"/>
+    <w:rsid w:val="006314B9"/>
     <w:rsid w:val="006366B0"/>
     <w:rsid w:val="006B711D"/>
     <w:rsid w:val="0099300C"/>
     <w:rsid w:val="00B14C86"/>
     <w:rsid w:val="00B85BAB"/>
     <w:rsid w:val="00C33711"/>
+    <w:rsid w:val="00D305EB"/>
     <w:rsid w:val="00E2046D"/>
   </w:rsids>
   <m:mathPr>
@@ -3103,15 +3092,6 @@
 </file>
 
 <file path=customXml/item1.xml><?xml version="1.0" encoding="utf-8"?>
-<?mso-contentType ?>
-<FormTemplates xmlns="http://schemas.microsoft.com/sharepoint/v3/contenttype/forms">
-  <Display>DocumentLibraryForm</Display>
-  <Edit>DocumentLibraryForm</Edit>
-  <New>DocumentLibraryForm</New>
-</FormTemplates>
-</file>
-
-<file path=customXml/item2.xml><?xml version="1.0" encoding="utf-8"?>
 <p:properties xmlns:p="http://schemas.microsoft.com/office/2006/metadata/properties" xmlns:xsi="http://www.w3.org/2001/XMLSchema-instance" xmlns:pc="http://schemas.microsoft.com/office/infopath/2007/PartnerControls">
   <documentManagement>
     <lcf76f155ced4ddcb4097134ff3c332f xmlns="3f109a48-3752-4c10-81b4-55fc0b1e9497">
@@ -3120,6 +3100,15 @@
     <TaxCatchAll xmlns="7d5a626d-f509-44d4-b02c-d15838480747" xsi:nil="true"/>
   </documentManagement>
 </p:properties>
+</file>
+
+<file path=customXml/item2.xml><?xml version="1.0" encoding="utf-8"?>
+<?mso-contentType ?>
+<FormTemplates xmlns="http://schemas.microsoft.com/sharepoint/v3/contenttype/forms">
+  <Display>DocumentLibraryForm</Display>
+  <Edit>DocumentLibraryForm</Edit>
+  <New>DocumentLibraryForm</New>
+</FormTemplates>
 </file>
 
 <file path=customXml/item3.xml><?xml version="1.0" encoding="utf-8"?>
@@ -3372,20 +3361,20 @@
 </file>
 
 <file path=customXml/itemProps1.xml><?xml version="1.0" encoding="utf-8"?>
-<ds:datastoreItem xmlns:ds="http://schemas.openxmlformats.org/officeDocument/2006/customXml" ds:itemID="{4E78486C-5569-4B62-82B5-69C733960F8C}">
-  <ds:schemaRefs>
-    <ds:schemaRef ds:uri="http://schemas.microsoft.com/sharepoint/v3/contenttype/forms"/>
-  </ds:schemaRefs>
-</ds:datastoreItem>
-</file>
-
-<file path=customXml/itemProps2.xml><?xml version="1.0" encoding="utf-8"?>
 <ds:datastoreItem xmlns:ds="http://schemas.openxmlformats.org/officeDocument/2006/customXml" ds:itemID="{D39E26EF-FAB3-410B-98D4-7A8D1F754B30}">
   <ds:schemaRefs>
     <ds:schemaRef ds:uri="http://schemas.microsoft.com/office/2006/metadata/properties"/>
     <ds:schemaRef ds:uri="http://schemas.microsoft.com/office/infopath/2007/PartnerControls"/>
     <ds:schemaRef ds:uri="3f109a48-3752-4c10-81b4-55fc0b1e9497"/>
     <ds:schemaRef ds:uri="7d5a626d-f509-44d4-b02c-d15838480747"/>
+  </ds:schemaRefs>
+</ds:datastoreItem>
+</file>
+
+<file path=customXml/itemProps2.xml><?xml version="1.0" encoding="utf-8"?>
+<ds:datastoreItem xmlns:ds="http://schemas.openxmlformats.org/officeDocument/2006/customXml" ds:itemID="{4E78486C-5569-4B62-82B5-69C733960F8C}">
+  <ds:schemaRefs>
+    <ds:schemaRef ds:uri="http://schemas.microsoft.com/sharepoint/v3/contenttype/forms"/>
   </ds:schemaRefs>
 </ds:datastoreItem>
 </file>

</xml_diff>